<commit_message>
HUONG_DAN_BAI2: muc B1-B6 dung khi nao
Co-Authored-By: Claude Opus 5.5 <noreply@anthropic.com>
</commit_message>
<xml_diff>
--- a/KIT_BAI2/HUONG_DAN_BAI2.docx
+++ b/KIT_BAI2/HUONG_DAN_BAI2.docx
@@ -2794,6 +2794,694 @@
         <w:rPr>
           <w:b w:val="0"/>
         </w:rPr>
+        <w:t>PHẦN 6b. CÁC NOTEBOOK B1–B6 DÙNG KHI NÀO</w:t>
+      </w:r>
+    </w:p>
+    <w:p>
+      <w:r>
+        <w:rPr>
+          <w:b w:val="0"/>
+        </w:rPr>
+        <w:t xml:space="preserve">Bình thường chỉ cần </w:t>
+      </w:r>
+      <w:r>
+        <w:rPr>
+          <w:b/>
+        </w:rPr>
+        <w:t>B0 + CHAY_TU_DONG</w:t>
+      </w:r>
+      <w:r>
+        <w:rPr>
+          <w:b w:val="0"/>
+        </w:rPr>
+        <w:t>. B1–B6 là từng bước của CHAY_TU_DONG tách riêng, dùng khi một bước bị kẹt hoặc muốn chỉnh riêng một bước.</w:t>
+      </w:r>
+    </w:p>
+    <w:tbl>
+      <w:tblPr>
+        <w:tblStyle w:val="TableGrid"/>
+        <w:tblW w:type="auto" w:w="0"/>
+        <w:tblLook w:firstColumn="1" w:firstRow="1" w:lastColumn="0" w:lastRow="0" w:noHBand="0" w:noVBand="1" w:val="04A0"/>
+      </w:tblPr>
+      <w:tblGrid>
+        <w:gridCol w:w="2880"/>
+        <w:gridCol w:w="2880"/>
+        <w:gridCol w:w="2880"/>
+      </w:tblGrid>
+      <w:tr>
+        <w:tc>
+          <w:tcPr>
+            <w:tcW w:type="dxa" w:w="2880"/>
+            <w:shd w:val="clear" w:color="auto" w:fill="DCE6F1"/>
+          </w:tcPr>
+          <w:p>
+            <w:r>
+              <w:rPr>
+                <w:b/>
+              </w:rPr>
+              <w:t>notebook</w:t>
+            </w:r>
+          </w:p>
+        </w:tc>
+        <w:tc>
+          <w:tcPr>
+            <w:tcW w:type="dxa" w:w="2880"/>
+            <w:shd w:val="clear" w:color="auto" w:fill="DCE6F1"/>
+          </w:tcPr>
+          <w:p>
+            <w:r>
+              <w:rPr>
+                <w:b/>
+              </w:rPr>
+              <w:t>dùng khi</w:t>
+            </w:r>
+          </w:p>
+        </w:tc>
+        <w:tc>
+          <w:tcPr>
+            <w:tcW w:type="dxa" w:w="2880"/>
+            <w:shd w:val="clear" w:color="auto" w:fill="DCE6F1"/>
+          </w:tcPr>
+          <w:p>
+            <w:r>
+              <w:rPr>
+                <w:b/>
+              </w:rPr>
+              <w:t>cách chạy</w:t>
+            </w:r>
+          </w:p>
+        </w:tc>
+      </w:tr>
+      <w:tr>
+        <w:tc>
+          <w:tcPr>
+            <w:tcW w:type="dxa" w:w="2880"/>
+          </w:tcPr>
+          <w:p>
+            <w:r>
+              <w:rPr>
+                <w:b/>
+              </w:rPr>
+              <w:t>B0_cai_dat</w:t>
+            </w:r>
+          </w:p>
+        </w:tc>
+        <w:tc>
+          <w:tcPr>
+            <w:tcW w:type="dxa" w:w="2880"/>
+          </w:tcPr>
+          <w:p>
+            <w:r>
+              <w:rPr>
+                <w:b/>
+              </w:rPr>
+              <w:t>luôn chạy đầu tiên, một lần</w:t>
+            </w:r>
+          </w:p>
+        </w:tc>
+        <w:tc>
+          <w:tcPr>
+            <w:tcW w:type="dxa" w:w="2880"/>
+          </w:tcPr>
+          <w:p>
+            <w:r>
+              <w:rPr>
+                <w:b w:val="0"/>
+              </w:rPr>
+              <w:t>Shift + Enter từng ô</w:t>
+            </w:r>
+          </w:p>
+        </w:tc>
+      </w:tr>
+      <w:tr>
+        <w:tc>
+          <w:tcPr>
+            <w:tcW w:type="dxa" w:w="2880"/>
+          </w:tcPr>
+          <w:p>
+            <w:r>
+              <w:rPr>
+                <w:b/>
+              </w:rPr>
+              <w:t>CHAY_TU_DONG</w:t>
+            </w:r>
+          </w:p>
+        </w:tc>
+        <w:tc>
+          <w:tcPr>
+            <w:tcW w:type="dxa" w:w="2880"/>
+          </w:tcPr>
+          <w:p>
+            <w:r>
+              <w:rPr>
+                <w:b/>
+              </w:rPr>
+              <w:t>cách chính</w:t>
+            </w:r>
+            <w:r>
+              <w:rPr>
+                <w:b w:val="0"/>
+              </w:rPr>
+              <w:t xml:space="preserve"> cho đề đoán nhãn / con số</w:t>
+            </w:r>
+          </w:p>
+        </w:tc>
+        <w:tc>
+          <w:tcPr>
+            <w:tcW w:type="dxa" w:w="2880"/>
+          </w:tcPr>
+          <w:p>
+            <w:r>
+              <w:rPr>
+                <w:b w:val="0"/>
+              </w:rPr>
+              <w:t>sửa ô ✏️ → Run All</w:t>
+            </w:r>
+          </w:p>
+        </w:tc>
+      </w:tr>
+      <w:tr>
+        <w:tc>
+          <w:tcPr>
+            <w:tcW w:type="dxa" w:w="2880"/>
+          </w:tcPr>
+          <w:p>
+            <w:r>
+              <w:rPr>
+                <w:b/>
+              </w:rPr>
+              <w:t>B5_hoi_dap_anh</w:t>
+            </w:r>
+          </w:p>
+        </w:tc>
+        <w:tc>
+          <w:tcPr>
+            <w:tcW w:type="dxa" w:w="2880"/>
+          </w:tcPr>
+          <w:p>
+            <w:r>
+              <w:rPr>
+                <w:b w:val="0"/>
+              </w:rPr>
+              <w:t xml:space="preserve">đề bắt </w:t>
+            </w:r>
+            <w:r>
+              <w:rPr>
+                <w:b/>
+              </w:rPr>
+              <w:t>viết chữ từ ảnh</w:t>
+            </w:r>
+            <w:r>
+              <w:rPr>
+                <w:b w:val="0"/>
+              </w:rPr>
+              <w:t xml:space="preserve"> (trả lời câu hỏi về ảnh, mô tả ảnh)</w:t>
+            </w:r>
+          </w:p>
+        </w:tc>
+        <w:tc>
+          <w:tcPr>
+            <w:tcW w:type="dxa" w:w="2880"/>
+          </w:tcPr>
+          <w:p>
+            <w:r>
+              <w:rPr>
+                <w:b w:val="0"/>
+              </w:rPr>
+              <w:t xml:space="preserve">B0 (cả ô cuối) → mở B5 → Shift + Enter từng ô; ô thử 5 ảnh xem câu trả lời có giống đáp án không; ô cuối sửa </w:t>
+            </w:r>
+            <w:r>
+              <w:rPr>
+                <w:rFonts w:ascii="Consolas" w:hAnsi="Consolas"/>
+                <w:b w:val="0"/>
+                <w:color w:val="A31F34"/>
+                <w:sz w:val="20"/>
+              </w:rPr>
+              <w:t>FILE_MAU</w:t>
+            </w:r>
+            <w:r>
+              <w:rPr>
+                <w:b w:val="0"/>
+              </w:rPr>
+              <w:t xml:space="preserve">, </w:t>
+            </w:r>
+            <w:r>
+              <w:rPr>
+                <w:rFonts w:ascii="Consolas" w:hAnsi="Consolas"/>
+                <w:b w:val="0"/>
+                <w:color w:val="A31F34"/>
+                <w:sz w:val="20"/>
+              </w:rPr>
+              <w:t>COT_ID</w:t>
+            </w:r>
+            <w:r>
+              <w:rPr>
+                <w:b w:val="0"/>
+              </w:rPr>
+              <w:t xml:space="preserve">, </w:t>
+            </w:r>
+            <w:r>
+              <w:rPr>
+                <w:rFonts w:ascii="Consolas" w:hAnsi="Consolas"/>
+                <w:b w:val="0"/>
+                <w:color w:val="A31F34"/>
+                <w:sz w:val="20"/>
+              </w:rPr>
+              <w:t>COT_NHAN</w:t>
+            </w:r>
+            <w:r>
+              <w:rPr>
+                <w:b w:val="0"/>
+              </w:rPr>
+              <w:t xml:space="preserve"> theo file nộp mẫu</w:t>
+            </w:r>
+          </w:p>
+        </w:tc>
+      </w:tr>
+      <w:tr>
+        <w:tc>
+          <w:tcPr>
+            <w:tcW w:type="dxa" w:w="2880"/>
+          </w:tcPr>
+          <w:p>
+            <w:r>
+              <w:rPr>
+                <w:b w:val="0"/>
+              </w:rPr>
+              <w:t>B1_du_lieu</w:t>
+            </w:r>
+          </w:p>
+        </w:tc>
+        <w:tc>
+          <w:tcPr>
+            <w:tcW w:type="dxa" w:w="2880"/>
+          </w:tcPr>
+          <w:p>
+            <w:r>
+              <w:rPr>
+                <w:b w:val="0"/>
+              </w:rPr>
+              <w:t xml:space="preserve">máy </w:t>
+            </w:r>
+            <w:r>
+              <w:rPr>
+                <w:b/>
+              </w:rPr>
+              <w:t>không tự đọc được</w:t>
+            </w:r>
+            <w:r>
+              <w:rPr>
+                <w:b w:val="0"/>
+              </w:rPr>
+              <w:t xml:space="preserve"> dữ liệu (báo lỗi ở bước đọc / đoán cột)</w:t>
+            </w:r>
+          </w:p>
+        </w:tc>
+        <w:tc>
+          <w:tcPr>
+            <w:tcW w:type="dxa" w:w="2880"/>
+          </w:tcPr>
+          <w:p>
+            <w:r>
+              <w:rPr>
+                <w:b w:val="0"/>
+              </w:rPr>
+              <w:t xml:space="preserve">sửa ô ✏️ đường dẫn → chạy → xem bảng in ra → sửa ô ✏️ tên cột → chạy hết. Ra </w:t>
+            </w:r>
+            <w:r>
+              <w:rPr>
+                <w:rFonts w:ascii="Consolas" w:hAnsi="Consolas"/>
+                <w:b w:val="0"/>
+                <w:color w:val="A31F34"/>
+                <w:sz w:val="20"/>
+              </w:rPr>
+              <w:t>work_b2/bang_chuan.csv</w:t>
+            </w:r>
+            <w:r>
+              <w:rPr>
+                <w:b w:val="0"/>
+              </w:rPr>
+              <w:t>, sau đó chạy B2 → B3</w:t>
+            </w:r>
+          </w:p>
+        </w:tc>
+      </w:tr>
+      <w:tr>
+        <w:tc>
+          <w:tcPr>
+            <w:tcW w:type="dxa" w:w="2880"/>
+          </w:tcPr>
+          <w:p>
+            <w:r>
+              <w:rPr>
+                <w:b w:val="0"/>
+              </w:rPr>
+              <w:t>B2_dac_trung</w:t>
+            </w:r>
+          </w:p>
+        </w:tc>
+        <w:tc>
+          <w:tcPr>
+            <w:tcW w:type="dxa" w:w="2880"/>
+          </w:tcPr>
+          <w:p>
+            <w:r>
+              <w:rPr>
+                <w:b w:val="0"/>
+              </w:rPr>
+              <w:t xml:space="preserve">muốn </w:t>
+            </w:r>
+            <w:r>
+              <w:rPr>
+                <w:b/>
+              </w:rPr>
+              <w:t>đổi mô hình đọc ảnh / chữ</w:t>
+            </w:r>
+            <w:r>
+              <w:rPr>
+                <w:b w:val="0"/>
+              </w:rPr>
+              <w:t xml:space="preserve"> (vd thêm </w:t>
+            </w:r>
+            <w:r>
+              <w:rPr>
+                <w:rFonts w:ascii="Consolas" w:hAnsi="Consolas"/>
+                <w:b w:val="0"/>
+                <w:color w:val="A31F34"/>
+                <w:sz w:val="20"/>
+              </w:rPr>
+              <w:t>"clip_l"</w:t>
+            </w:r>
+            <w:r>
+              <w:rPr>
+                <w:b w:val="0"/>
+              </w:rPr>
+              <w:t>)</w:t>
+            </w:r>
+          </w:p>
+        </w:tc>
+        <w:tc>
+          <w:tcPr>
+            <w:tcW w:type="dxa" w:w="2880"/>
+          </w:tcPr>
+          <w:p>
+            <w:r>
+              <w:rPr>
+                <w:b w:val="0"/>
+              </w:rPr>
+              <w:t xml:space="preserve">sửa dòng </w:t>
+            </w:r>
+            <w:r>
+              <w:rPr>
+                <w:rFonts w:ascii="Consolas" w:hAnsi="Consolas"/>
+                <w:b w:val="0"/>
+                <w:color w:val="A31F34"/>
+                <w:sz w:val="20"/>
+              </w:rPr>
+              <w:t>F = L.dac_trung(df, anh=(...), chu=(...))</w:t>
+            </w:r>
+            <w:r>
+              <w:rPr>
+                <w:b w:val="0"/>
+              </w:rPr>
+              <w:t xml:space="preserve"> → chạy hết</w:t>
+            </w:r>
+          </w:p>
+        </w:tc>
+      </w:tr>
+      <w:tr>
+        <w:tc>
+          <w:tcPr>
+            <w:tcW w:type="dxa" w:w="2880"/>
+          </w:tcPr>
+          <w:p>
+            <w:r>
+              <w:rPr>
+                <w:b w:val="0"/>
+              </w:rPr>
+              <w:t>B3_mo_hinh_nhanh</w:t>
+            </w:r>
+          </w:p>
+        </w:tc>
+        <w:tc>
+          <w:tcPr>
+            <w:tcW w:type="dxa" w:w="2880"/>
+          </w:tcPr>
+          <w:p>
+            <w:r>
+              <w:rPr>
+                <w:b w:val="0"/>
+              </w:rPr>
+              <w:t xml:space="preserve">chạy lại </w:t>
+            </w:r>
+            <w:r>
+              <w:rPr>
+                <w:b/>
+              </w:rPr>
+              <w:t>mô hình nhanh</w:t>
+            </w:r>
+            <w:r>
+              <w:rPr>
+                <w:b w:val="0"/>
+              </w:rPr>
+              <w:t xml:space="preserve"> sau B1/B2, hoặc đề </w:t>
+            </w:r>
+            <w:r>
+              <w:rPr>
+                <w:b/>
+              </w:rPr>
+              <w:t>ghép câu ↔ ảnh</w:t>
+            </w:r>
+          </w:p>
+        </w:tc>
+        <w:tc>
+          <w:tcPr>
+            <w:tcW w:type="dxa" w:w="2880"/>
+          </w:tcPr>
+          <w:p>
+            <w:r>
+              <w:rPr>
+                <w:b w:val="0"/>
+              </w:rPr>
+              <w:t xml:space="preserve">chạy hết; ô cuối sửa </w:t>
+            </w:r>
+            <w:r>
+              <w:rPr>
+                <w:rFonts w:ascii="Consolas" w:hAnsi="Consolas"/>
+                <w:b w:val="0"/>
+                <w:color w:val="A31F34"/>
+                <w:sz w:val="20"/>
+              </w:rPr>
+              <w:t>FILE_MAU</w:t>
+            </w:r>
+            <w:r>
+              <w:rPr>
+                <w:b w:val="0"/>
+              </w:rPr>
+              <w:t xml:space="preserve">, </w:t>
+            </w:r>
+            <w:r>
+              <w:rPr>
+                <w:rFonts w:ascii="Consolas" w:hAnsi="Consolas"/>
+                <w:b w:val="0"/>
+                <w:color w:val="A31F34"/>
+                <w:sz w:val="20"/>
+              </w:rPr>
+              <w:t>COT_ID</w:t>
+            </w:r>
+            <w:r>
+              <w:rPr>
+                <w:b w:val="0"/>
+              </w:rPr>
+              <w:t xml:space="preserve">, </w:t>
+            </w:r>
+            <w:r>
+              <w:rPr>
+                <w:rFonts w:ascii="Consolas" w:hAnsi="Consolas"/>
+                <w:b w:val="0"/>
+                <w:color w:val="A31F34"/>
+                <w:sz w:val="20"/>
+              </w:rPr>
+              <w:t>COT_NHAN</w:t>
+            </w:r>
+          </w:p>
+        </w:tc>
+      </w:tr>
+      <w:tr>
+        <w:tc>
+          <w:tcPr>
+            <w:tcW w:type="dxa" w:w="2880"/>
+          </w:tcPr>
+          <w:p>
+            <w:r>
+              <w:rPr>
+                <w:b w:val="0"/>
+              </w:rPr>
+              <w:t>B4_tinh_chinh</w:t>
+            </w:r>
+          </w:p>
+        </w:tc>
+        <w:tc>
+          <w:tcPr>
+            <w:tcW w:type="dxa" w:w="2880"/>
+          </w:tcPr>
+          <w:p>
+            <w:r>
+              <w:rPr>
+                <w:b/>
+              </w:rPr>
+              <w:t>tinh chỉnh lại</w:t>
+            </w:r>
+            <w:r>
+              <w:rPr>
+                <w:b w:val="0"/>
+              </w:rPr>
+              <w:t xml:space="preserve"> với cấu hình khác mà không chạy lại từ đầu</w:t>
+            </w:r>
+          </w:p>
+        </w:tc>
+        <w:tc>
+          <w:tcPr>
+            <w:tcW w:type="dxa" w:w="2880"/>
+          </w:tcPr>
+          <w:p>
+            <w:r>
+              <w:rPr>
+                <w:b w:val="0"/>
+              </w:rPr>
+              <w:t xml:space="preserve">sửa </w:t>
+            </w:r>
+            <w:r>
+              <w:rPr>
+                <w:rFonts w:ascii="Consolas" w:hAnsi="Consolas"/>
+                <w:b w:val="0"/>
+                <w:color w:val="A31F34"/>
+                <w:sz w:val="20"/>
+              </w:rPr>
+              <w:t>ANH, CHU</w:t>
+            </w:r>
+            <w:r>
+              <w:rPr>
+                <w:b w:val="0"/>
+              </w:rPr>
+              <w:t xml:space="preserve">, </w:t>
+            </w:r>
+            <w:r>
+              <w:rPr>
+                <w:rFonts w:ascii="Consolas" w:hAnsi="Consolas"/>
+                <w:b w:val="0"/>
+                <w:color w:val="A31F34"/>
+                <w:sz w:val="20"/>
+              </w:rPr>
+              <w:t>EPOCHS, BATCH, PHUT</w:t>
+            </w:r>
+            <w:r>
+              <w:rPr>
+                <w:b w:val="0"/>
+              </w:rPr>
+              <w:t xml:space="preserve"> → chạy hết</w:t>
+            </w:r>
+          </w:p>
+        </w:tc>
+      </w:tr>
+      <w:tr>
+        <w:tc>
+          <w:tcPr>
+            <w:tcW w:type="dxa" w:w="2880"/>
+          </w:tcPr>
+          <w:p>
+            <w:r>
+              <w:rPr>
+                <w:b w:val="0"/>
+              </w:rPr>
+              <w:t>B6_ghep_nop</w:t>
+            </w:r>
+          </w:p>
+        </w:tc>
+        <w:tc>
+          <w:tcPr>
+            <w:tcW w:type="dxa" w:w="2880"/>
+          </w:tcPr>
+          <w:p>
+            <w:r>
+              <w:rPr>
+                <w:b w:val="0"/>
+              </w:rPr>
+              <w:t xml:space="preserve">tự </w:t>
+            </w:r>
+            <w:r>
+              <w:rPr>
+                <w:b/>
+              </w:rPr>
+              <w:t>trộn</w:t>
+            </w:r>
+            <w:r>
+              <w:rPr>
+                <w:b w:val="0"/>
+              </w:rPr>
+              <w:t xml:space="preserve"> các kết quả với trọng số mình chọn</w:t>
+            </w:r>
+          </w:p>
+        </w:tc>
+        <w:tc>
+          <w:tcPr>
+            <w:tcW w:type="dxa" w:w="2880"/>
+          </w:tcPr>
+          <w:p>
+            <w:r>
+              <w:rPr>
+                <w:b w:val="0"/>
+              </w:rPr>
+              <w:t>xem bước 21</w:t>
+            </w:r>
+          </w:p>
+        </w:tc>
+      </w:tr>
+    </w:tbl>
+    <w:p/>
+    <w:p>
+      <w:r>
+        <w:rPr>
+          <w:b w:val="0"/>
+        </w:rPr>
+        <w:t xml:space="preserve">Thứ tự khi phải làm tay: </w:t>
+      </w:r>
+      <w:r>
+        <w:rPr>
+          <w:b/>
+        </w:rPr>
+        <w:t>B1 → B2 → B3 (nộp) → B4 → B6 (nộp)</w:t>
+      </w:r>
+      <w:r>
+        <w:rPr>
+          <w:b w:val="0"/>
+        </w:rPr>
+        <w:t xml:space="preserve">. Mỗi notebook đọc kết quả notebook trước đã lưu trong </w:t>
+      </w:r>
+      <w:r>
+        <w:rPr>
+          <w:rFonts w:ascii="Consolas" w:hAnsi="Consolas"/>
+          <w:b w:val="0"/>
+          <w:color w:val="A31F34"/>
+          <w:sz w:val="20"/>
+        </w:rPr>
+        <w:t>work_b2/</w:t>
+      </w:r>
+      <w:r>
+        <w:rPr>
+          <w:b w:val="0"/>
+        </w:rPr>
+        <w:t>, nên có thể tắt đi mở lại.</w:t>
+      </w:r>
+    </w:p>
+    <w:p>
+      <w:pPr>
+        <w:pStyle w:val="Heading2"/>
+      </w:pPr>
+      <w:r>
+        <w:rPr>
+          <w:b w:val="0"/>
+        </w:rPr>
         <w:t>PHẦN 7. BẢNG GIẢI THÍCH NHANH</w:t>
       </w:r>
     </w:p>

</xml_diff>

<commit_message>
HUONG_DAN_BAI2: bang cac file la gi, dung khi nao
Co-Authored-By: Claude Opus 5.5 <noreply@anthropic.com>
</commit_message>
<xml_diff>
--- a/KIT_BAI2/HUONG_DAN_BAI2.docx
+++ b/KIT_BAI2/HUONG_DAN_BAI2.docx
@@ -143,7 +143,7 @@
             <w:color w:val="1F4E99"/>
             <w:u w:val="single"/>
           </w:rPr>
-          <w:t xml:space="preserve">PHẦN 7. BẢNG GIẢI THÍCH NHANH</w:t>
+          <w:t xml:space="preserve">PHẦN 6c. CÁC FILE TRONG THƯ MỤC BÀI 2 LÀ GÌ</w:t>
         </w:r>
       </w:hyperlink>
     </w:p>
@@ -158,7 +158,7 @@
             <w:color w:val="1F4E99"/>
             <w:u w:val="single"/>
           </w:rPr>
-          <w:t xml:space="preserve">PHẦN 8. DÙNG AI CỦA BTC (chỉ để sửa lỗi; 200k mỗi phiên)</w:t>
+          <w:t xml:space="preserve">PHẦN 7. BẢNG GIẢI THÍCH NHANH</w:t>
         </w:r>
       </w:hyperlink>
     </w:p>
@@ -173,6 +173,21 @@
             <w:color w:val="1F4E99"/>
             <w:u w:val="single"/>
           </w:rPr>
+          <w:t xml:space="preserve">PHẦN 8. DÙNG AI CỦA BTC (chỉ để sửa lỗi; 200k mỗi phiên)</w:t>
+        </w:r>
+      </w:hyperlink>
+    </w:p>
+    <w:p>
+      <w:pPr>
+        <w:spacing w:after="40"/>
+        <w:ind w:left="360"/>
+      </w:pPr>
+      <w:hyperlink w:anchor="muc_11">
+        <w:r>
+          <w:rPr>
+            <w:color w:val="1F4E99"/>
+            <w:u w:val="single"/>
+          </w:rPr>
           <w:t xml:space="preserve">GẶP LỖI</w:t>
         </w:r>
       </w:hyperlink>
@@ -182,7 +197,7 @@
         <w:spacing w:after="40"/>
         <w:ind w:left="360"/>
       </w:pPr>
-      <w:hyperlink w:anchor="muc_11">
+      <w:hyperlink w:anchor="muc_12">
         <w:r>
           <w:rPr>
             <w:color w:val="1F4E99"/>
@@ -3694,9 +3709,1213 @@
         <w:rPr>
           <w:b w:val="0"/>
         </w:rPr>
+        <w:t>PHẦN 6c. CÁC FILE TRONG THƯ MỤC BÀI 2 LÀ GÌ</w:t>
+      </w:r>
+      <w:bookmarkEnd w:id="8"/>
+    </w:p>
+    <w:tbl>
+      <w:tblPr>
+        <w:tblStyle w:val="TableGrid"/>
+        <w:tblW w:type="auto" w:w="0"/>
+        <w:tblLook w:firstColumn="1" w:firstRow="1" w:lastColumn="0" w:lastRow="0" w:noHBand="0" w:noVBand="1" w:val="04A0"/>
+      </w:tblPr>
+      <w:tblGrid>
+        <w:gridCol w:w="2880"/>
+        <w:gridCol w:w="2880"/>
+        <w:gridCol w:w="2880"/>
+      </w:tblGrid>
+      <w:tr>
+        <w:tc>
+          <w:tcPr>
+            <w:tcW w:type="dxa" w:w="2880"/>
+            <w:shd w:val="clear" w:color="auto" w:fill="DCE6F1"/>
+          </w:tcPr>
+          <w:p>
+            <w:r>
+              <w:rPr>
+                <w:b/>
+              </w:rPr>
+              <w:t>file / thư mục</w:t>
+            </w:r>
+          </w:p>
+        </w:tc>
+        <w:tc>
+          <w:tcPr>
+            <w:tcW w:type="dxa" w:w="2880"/>
+            <w:shd w:val="clear" w:color="auto" w:fill="DCE6F1"/>
+          </w:tcPr>
+          <w:p>
+            <w:r>
+              <w:rPr>
+                <w:b/>
+              </w:rPr>
+              <w:t>là gì</w:t>
+            </w:r>
+          </w:p>
+        </w:tc>
+        <w:tc>
+          <w:tcPr>
+            <w:tcW w:type="dxa" w:w="2880"/>
+            <w:shd w:val="clear" w:color="auto" w:fill="DCE6F1"/>
+          </w:tcPr>
+          <w:p>
+            <w:r>
+              <w:rPr>
+                <w:b/>
+              </w:rPr>
+              <w:t>dùng khi nào</w:t>
+            </w:r>
+          </w:p>
+        </w:tc>
+      </w:tr>
+      <w:tr>
+        <w:tc>
+          <w:tcPr>
+            <w:tcW w:type="dxa" w:w="2880"/>
+          </w:tcPr>
+          <w:p>
+            <w:r>
+              <w:rPr>
+                <w:rFonts w:ascii="Consolas" w:hAnsi="Consolas"/>
+                <w:b/>
+                <w:color w:val="A31F34"/>
+                <w:sz w:val="20"/>
+              </w:rPr>
+              <w:t>notebooks/CHAY_TU_DONG.ipynb</w:t>
+            </w:r>
+          </w:p>
+        </w:tc>
+        <w:tc>
+          <w:tcPr>
+            <w:tcW w:type="dxa" w:w="2880"/>
+          </w:tcPr>
+          <w:p>
+            <w:r>
+              <w:rPr>
+                <w:b w:val="0"/>
+              </w:rPr>
+              <w:t>chạy cả bài 2 một lần</w:t>
+            </w:r>
+          </w:p>
+        </w:tc>
+        <w:tc>
+          <w:tcPr>
+            <w:tcW w:type="dxa" w:w="2880"/>
+          </w:tcPr>
+          <w:p>
+            <w:r>
+              <w:rPr>
+                <w:b/>
+              </w:rPr>
+              <w:t>cách chính</w:t>
+            </w:r>
+            <w:r>
+              <w:rPr>
+                <w:b w:val="0"/>
+              </w:rPr>
+              <w:t>, Phần 5</w:t>
+            </w:r>
+          </w:p>
+        </w:tc>
+      </w:tr>
+      <w:tr>
+        <w:tc>
+          <w:tcPr>
+            <w:tcW w:type="dxa" w:w="2880"/>
+          </w:tcPr>
+          <w:p>
+            <w:r>
+              <w:rPr>
+                <w:rFonts w:ascii="Consolas" w:hAnsi="Consolas"/>
+                <w:b/>
+                <w:color w:val="A31F34"/>
+                <w:sz w:val="20"/>
+              </w:rPr>
+              <w:t>notebooks/B0_cai_dat.ipynb</w:t>
+            </w:r>
+          </w:p>
+        </w:tc>
+        <w:tc>
+          <w:tcPr>
+            <w:tcW w:type="dxa" w:w="2880"/>
+          </w:tcPr>
+          <w:p>
+            <w:r>
+              <w:rPr>
+                <w:b w:val="0"/>
+              </w:rPr>
+              <w:t>cài thư viện, tải mô hình</w:t>
+            </w:r>
+          </w:p>
+        </w:tc>
+        <w:tc>
+          <w:tcPr>
+            <w:tcW w:type="dxa" w:w="2880"/>
+          </w:tcPr>
+          <w:p>
+            <w:r>
+              <w:rPr>
+                <w:b/>
+              </w:rPr>
+              <w:t>luôn chạy đầu tiên</w:t>
+            </w:r>
+            <w:r>
+              <w:rPr>
+                <w:b w:val="0"/>
+              </w:rPr>
+              <w:t>, Phần 2</w:t>
+            </w:r>
+          </w:p>
+        </w:tc>
+      </w:tr>
+      <w:tr>
+        <w:tc>
+          <w:tcPr>
+            <w:tcW w:type="dxa" w:w="2880"/>
+          </w:tcPr>
+          <w:p>
+            <w:r>
+              <w:rPr>
+                <w:rFonts w:ascii="Consolas" w:hAnsi="Consolas"/>
+                <w:b w:val="0"/>
+                <w:color w:val="A31F34"/>
+                <w:sz w:val="20"/>
+              </w:rPr>
+              <w:t>notebooks/B1</w:t>
+            </w:r>
+            <w:r>
+              <w:rPr>
+                <w:b w:val="0"/>
+              </w:rPr>
+              <w:t xml:space="preserve"> … </w:t>
+            </w:r>
+            <w:r>
+              <w:rPr>
+                <w:rFonts w:ascii="Consolas" w:hAnsi="Consolas"/>
+                <w:b w:val="0"/>
+                <w:color w:val="A31F34"/>
+                <w:sz w:val="20"/>
+              </w:rPr>
+              <w:t>B6</w:t>
+            </w:r>
+          </w:p>
+        </w:tc>
+        <w:tc>
+          <w:tcPr>
+            <w:tcW w:type="dxa" w:w="2880"/>
+          </w:tcPr>
+          <w:p>
+            <w:r>
+              <w:rPr>
+                <w:b w:val="0"/>
+              </w:rPr>
+              <w:t>từng bước của CHAY_TU_DONG tách riêng</w:t>
+            </w:r>
+          </w:p>
+        </w:tc>
+        <w:tc>
+          <w:tcPr>
+            <w:tcW w:type="dxa" w:w="2880"/>
+          </w:tcPr>
+          <w:p>
+            <w:r>
+              <w:rPr>
+                <w:b w:val="0"/>
+              </w:rPr>
+              <w:t>khi cần chỉnh tay một bước, Phần 6b</w:t>
+            </w:r>
+          </w:p>
+        </w:tc>
+      </w:tr>
+      <w:tr>
+        <w:tc>
+          <w:tcPr>
+            <w:tcW w:type="dxa" w:w="2880"/>
+          </w:tcPr>
+          <w:p>
+            <w:r>
+              <w:rPr>
+                <w:rFonts w:ascii="Consolas" w:hAnsi="Consolas"/>
+                <w:b w:val="0"/>
+                <w:color w:val="A31F34"/>
+                <w:sz w:val="20"/>
+              </w:rPr>
+              <w:t>notebooks/B5_hoi_dap_anh.ipynb</w:t>
+            </w:r>
+          </w:p>
+        </w:tc>
+        <w:tc>
+          <w:tcPr>
+            <w:tcW w:type="dxa" w:w="2880"/>
+          </w:tcPr>
+          <w:p>
+            <w:r>
+              <w:rPr>
+                <w:b w:val="0"/>
+              </w:rPr>
+              <w:t>hỏi đáp về ảnh, mô tả ảnh (Qwen2.5-VL)</w:t>
+            </w:r>
+          </w:p>
+        </w:tc>
+        <w:tc>
+          <w:tcPr>
+            <w:tcW w:type="dxa" w:w="2880"/>
+          </w:tcPr>
+          <w:p>
+            <w:r>
+              <w:rPr>
+                <w:b w:val="0"/>
+              </w:rPr>
+              <w:t xml:space="preserve">đề bắt </w:t>
+            </w:r>
+            <w:r>
+              <w:rPr>
+                <w:b/>
+              </w:rPr>
+              <w:t>viết chữ từ ảnh</w:t>
+            </w:r>
+          </w:p>
+        </w:tc>
+      </w:tr>
+      <w:tr>
+        <w:tc>
+          <w:tcPr>
+            <w:tcW w:type="dxa" w:w="2880"/>
+          </w:tcPr>
+          <w:p>
+            <w:r>
+              <w:rPr>
+                <w:rFonts w:ascii="Consolas" w:hAnsi="Consolas"/>
+                <w:b w:val="0"/>
+                <w:color w:val="A31F34"/>
+                <w:sz w:val="20"/>
+              </w:rPr>
+              <w:t>notebooks/b2lib.py</w:t>
+            </w:r>
+          </w:p>
+        </w:tc>
+        <w:tc>
+          <w:tcPr>
+            <w:tcW w:type="dxa" w:w="2880"/>
+          </w:tcPr>
+          <w:p>
+            <w:r>
+              <w:rPr>
+                <w:b w:val="0"/>
+              </w:rPr>
+              <w:t>thư viện chung, mọi notebook gọi</w:t>
+            </w:r>
+          </w:p>
+        </w:tc>
+        <w:tc>
+          <w:tcPr>
+            <w:tcW w:type="dxa" w:w="2880"/>
+          </w:tcPr>
+          <w:p>
+            <w:r>
+              <w:rPr>
+                <w:b w:val="0"/>
+              </w:rPr>
+              <w:t>không mở, trừ khi AI của BTC bảo sửa một hàm</w:t>
+            </w:r>
+          </w:p>
+        </w:tc>
+      </w:tr>
+      <w:tr>
+        <w:tc>
+          <w:tcPr>
+            <w:tcW w:type="dxa" w:w="2880"/>
+          </w:tcPr>
+          <w:p>
+            <w:r>
+              <w:rPr>
+                <w:rFonts w:ascii="Consolas" w:hAnsi="Consolas"/>
+                <w:b/>
+                <w:color w:val="A31F34"/>
+                <w:sz w:val="20"/>
+              </w:rPr>
+              <w:t>HUONG_DAN_BAI2.docx</w:t>
+            </w:r>
+          </w:p>
+        </w:tc>
+        <w:tc>
+          <w:tcPr>
+            <w:tcW w:type="dxa" w:w="2880"/>
+          </w:tcPr>
+          <w:p>
+            <w:r>
+              <w:rPr>
+                <w:b w:val="0"/>
+              </w:rPr>
+              <w:t>hướng dẫn này</w:t>
+            </w:r>
+          </w:p>
+        </w:tc>
+        <w:tc>
+          <w:tcPr>
+            <w:tcW w:type="dxa" w:w="2880"/>
+          </w:tcPr>
+          <w:p>
+            <w:r>
+              <w:rPr>
+                <w:b w:val="0"/>
+              </w:rPr>
+              <w:t>đọc khi làm</w:t>
+            </w:r>
+          </w:p>
+        </w:tc>
+      </w:tr>
+      <w:tr>
+        <w:tc>
+          <w:tcPr>
+            <w:tcW w:type="dxa" w:w="2880"/>
+          </w:tcPr>
+          <w:p>
+            <w:r>
+              <w:rPr>
+                <w:rFonts w:ascii="Consolas" w:hAnsi="Consolas"/>
+                <w:b w:val="0"/>
+                <w:color w:val="A31F34"/>
+                <w:sz w:val="20"/>
+              </w:rPr>
+              <w:t>README.md</w:t>
+            </w:r>
+          </w:p>
+        </w:tc>
+        <w:tc>
+          <w:tcPr>
+            <w:tcW w:type="dxa" w:w="2880"/>
+          </w:tcPr>
+          <w:p>
+            <w:r>
+              <w:rPr>
+                <w:b w:val="0"/>
+              </w:rPr>
+              <w:t>trang giới thiệu trên GitHub</w:t>
+            </w:r>
+          </w:p>
+        </w:tc>
+        <w:tc>
+          <w:tcPr>
+            <w:tcW w:type="dxa" w:w="2880"/>
+          </w:tcPr>
+          <w:p>
+            <w:r>
+              <w:rPr>
+                <w:b w:val="0"/>
+              </w:rPr>
+              <w:t>cho các bạn xem</w:t>
+            </w:r>
+          </w:p>
+        </w:tc>
+      </w:tr>
+      <w:tr>
+        <w:tc>
+          <w:tcPr>
+            <w:tcW w:type="dxa" w:w="2880"/>
+          </w:tcPr>
+          <w:p>
+            <w:r>
+              <w:rPr>
+                <w:rFonts w:ascii="Consolas" w:hAnsi="Consolas"/>
+                <w:b w:val="0"/>
+                <w:color w:val="A31F34"/>
+                <w:sz w:val="20"/>
+              </w:rPr>
+              <w:t>bai2.py</w:t>
+            </w:r>
+          </w:p>
+        </w:tc>
+        <w:tc>
+          <w:tcPr>
+            <w:tcW w:type="dxa" w:w="2880"/>
+          </w:tcPr>
+          <w:p>
+            <w:r>
+              <w:rPr>
+                <w:b w:val="0"/>
+              </w:rPr>
+              <w:t xml:space="preserve">chương trình hỏi đáp trong Terminal: bảng số, văn bản, ảnh, âm thanh, chia nhóm, </w:t>
+            </w:r>
+            <w:r>
+              <w:rPr>
+                <w:b/>
+              </w:rPr>
+              <w:t>video</w:t>
+            </w:r>
+            <w:r>
+              <w:rPr>
+                <w:b w:val="0"/>
+              </w:rPr>
+              <w:t xml:space="preserve">, </w:t>
+            </w:r>
+            <w:r>
+              <w:rPr>
+                <w:b/>
+              </w:rPr>
+              <w:t>dịch</w:t>
+            </w:r>
+          </w:p>
+        </w:tc>
+        <w:tc>
+          <w:tcPr>
+            <w:tcW w:type="dxa" w:w="2880"/>
+          </w:tcPr>
+          <w:p>
+            <w:r>
+              <w:rPr>
+                <w:b w:val="0"/>
+              </w:rPr>
+              <w:t xml:space="preserve">đề </w:t>
+            </w:r>
+            <w:r>
+              <w:rPr>
+                <w:b/>
+              </w:rPr>
+              <w:t>dịch</w:t>
+            </w:r>
+            <w:r>
+              <w:rPr>
+                <w:b w:val="0"/>
+              </w:rPr>
+              <w:t xml:space="preserve"> hoặc </w:t>
+            </w:r>
+            <w:r>
+              <w:rPr>
+                <w:b/>
+              </w:rPr>
+              <w:t>video</w:t>
+            </w:r>
+            <w:r>
+              <w:rPr>
+                <w:b w:val="0"/>
+              </w:rPr>
+              <w:t xml:space="preserve">: Terminal </w:t>
+            </w:r>
+            <w:r>
+              <w:rPr>
+                <w:rFonts w:ascii="Consolas" w:hAnsi="Consolas"/>
+                <w:b w:val="0"/>
+                <w:color w:val="A31F34"/>
+                <w:sz w:val="20"/>
+              </w:rPr>
+              <w:t>cd ~/B1/KIT_BAI2 &amp;&amp; python bai2.py</w:t>
+            </w:r>
+          </w:p>
+        </w:tc>
+      </w:tr>
+      <w:tr>
+        <w:tc>
+          <w:tcPr>
+            <w:tcW w:type="dxa" w:w="2880"/>
+          </w:tcPr>
+          <w:p>
+            <w:r>
+              <w:rPr>
+                <w:rFonts w:ascii="Consolas" w:hAnsi="Consolas"/>
+                <w:b w:val="0"/>
+                <w:color w:val="A31F34"/>
+                <w:sz w:val="20"/>
+              </w:rPr>
+              <w:t>SO_TAY_BAI2.md</w:t>
+            </w:r>
+          </w:p>
+        </w:tc>
+        <w:tc>
+          <w:tcPr>
+            <w:tcW w:type="dxa" w:w="2880"/>
+          </w:tcPr>
+          <w:p>
+            <w:r>
+              <w:rPr>
+                <w:b w:val="0"/>
+              </w:rPr>
+              <w:t xml:space="preserve">sổ tay của </w:t>
+            </w:r>
+            <w:r>
+              <w:rPr>
+                <w:rFonts w:ascii="Consolas" w:hAnsi="Consolas"/>
+                <w:b w:val="0"/>
+                <w:color w:val="A31F34"/>
+                <w:sz w:val="20"/>
+              </w:rPr>
+              <w:t>bai2.py</w:t>
+            </w:r>
+            <w:r>
+              <w:rPr>
+                <w:b w:val="0"/>
+              </w:rPr>
+              <w:t xml:space="preserve"> (câu hỏi máy hỏi, cách trả lời)</w:t>
+            </w:r>
+          </w:p>
+        </w:tc>
+        <w:tc>
+          <w:tcPr>
+            <w:tcW w:type="dxa" w:w="2880"/>
+          </w:tcPr>
+          <w:p>
+            <w:r>
+              <w:rPr>
+                <w:b w:val="0"/>
+              </w:rPr>
+              <w:t xml:space="preserve">khi dùng </w:t>
+            </w:r>
+            <w:r>
+              <w:rPr>
+                <w:rFonts w:ascii="Consolas" w:hAnsi="Consolas"/>
+                <w:b w:val="0"/>
+                <w:color w:val="A31F34"/>
+                <w:sz w:val="20"/>
+              </w:rPr>
+              <w:t>bai2.py</w:t>
+            </w:r>
+          </w:p>
+        </w:tc>
+      </w:tr>
+      <w:tr>
+        <w:tc>
+          <w:tcPr>
+            <w:tcW w:type="dxa" w:w="2880"/>
+          </w:tcPr>
+          <w:p>
+            <w:r>
+              <w:rPr>
+                <w:rFonts w:ascii="Consolas" w:hAnsi="Consolas"/>
+                <w:b w:val="0"/>
+                <w:color w:val="A31F34"/>
+                <w:sz w:val="20"/>
+              </w:rPr>
+              <w:t>yolo_mau.py</w:t>
+            </w:r>
+          </w:p>
+        </w:tc>
+        <w:tc>
+          <w:tcPr>
+            <w:tcW w:type="dxa" w:w="2880"/>
+          </w:tcPr>
+          <w:p>
+            <w:r>
+              <w:rPr>
+                <w:b w:val="0"/>
+              </w:rPr>
+              <w:t>khoanh / đếm vật thể, tô vùng ảnh (YOLO11)</w:t>
+            </w:r>
+          </w:p>
+        </w:tc>
+        <w:tc>
+          <w:tcPr>
+            <w:tcW w:type="dxa" w:w="2880"/>
+          </w:tcPr>
+          <w:p>
+            <w:r>
+              <w:rPr>
+                <w:b w:val="0"/>
+              </w:rPr>
+              <w:t xml:space="preserve">đề </w:t>
+            </w:r>
+            <w:r>
+              <w:rPr>
+                <w:b/>
+              </w:rPr>
+              <w:t>khoanh vật thể</w:t>
+            </w:r>
+            <w:r>
+              <w:rPr>
+                <w:b w:val="0"/>
+              </w:rPr>
+              <w:t xml:space="preserve">: Terminal </w:t>
+            </w:r>
+            <w:r>
+              <w:rPr>
+                <w:rFonts w:ascii="Consolas" w:hAnsi="Consolas"/>
+                <w:b w:val="0"/>
+                <w:color w:val="A31F34"/>
+                <w:sz w:val="20"/>
+              </w:rPr>
+              <w:t>cd ~/B1/KIT_BAI2 &amp;&amp; python yolo_mau.py</w:t>
+            </w:r>
+          </w:p>
+        </w:tc>
+      </w:tr>
+      <w:tr>
+        <w:tc>
+          <w:tcPr>
+            <w:tcW w:type="dxa" w:w="2880"/>
+          </w:tcPr>
+          <w:p>
+            <w:r>
+              <w:rPr>
+                <w:rFonts w:ascii="Consolas" w:hAnsi="Consolas"/>
+                <w:b w:val="0"/>
+                <w:color w:val="A31F34"/>
+                <w:sz w:val="20"/>
+              </w:rPr>
+              <w:t>mo_hinh/</w:t>
+            </w:r>
+          </w:p>
+        </w:tc>
+        <w:tc>
+          <w:tcPr>
+            <w:tcW w:type="dxa" w:w="2880"/>
+          </w:tcPr>
+          <w:p>
+            <w:r>
+              <w:rPr>
+                <w:b w:val="0"/>
+              </w:rPr>
+              <w:t>trọng số YOLO11 (</w:t>
+            </w:r>
+            <w:r>
+              <w:rPr>
+                <w:rFonts w:ascii="Consolas" w:hAnsi="Consolas"/>
+                <w:b w:val="0"/>
+                <w:color w:val="A31F34"/>
+                <w:sz w:val="20"/>
+              </w:rPr>
+              <w:t>yolo11n.pt</w:t>
+            </w:r>
+            <w:r>
+              <w:rPr>
+                <w:b w:val="0"/>
+              </w:rPr>
+              <w:t xml:space="preserve">, </w:t>
+            </w:r>
+            <w:r>
+              <w:rPr>
+                <w:rFonts w:ascii="Consolas" w:hAnsi="Consolas"/>
+                <w:b w:val="0"/>
+                <w:color w:val="A31F34"/>
+                <w:sz w:val="20"/>
+              </w:rPr>
+              <w:t>yolo11n-seg.pt</w:t>
+            </w:r>
+            <w:r>
+              <w:rPr>
+                <w:b w:val="0"/>
+              </w:rPr>
+              <w:t>)</w:t>
+            </w:r>
+          </w:p>
+        </w:tc>
+        <w:tc>
+          <w:tcPr>
+            <w:tcW w:type="dxa" w:w="2880"/>
+          </w:tcPr>
+          <w:p>
+            <w:r>
+              <w:rPr>
+                <w:rFonts w:ascii="Consolas" w:hAnsi="Consolas"/>
+                <w:b w:val="0"/>
+                <w:color w:val="A31F34"/>
+                <w:sz w:val="20"/>
+              </w:rPr>
+              <w:t>yolo_mau.py</w:t>
+            </w:r>
+            <w:r>
+              <w:rPr>
+                <w:b w:val="0"/>
+              </w:rPr>
+              <w:t xml:space="preserve"> tự dùng, không cần mở</w:t>
+            </w:r>
+          </w:p>
+        </w:tc>
+      </w:tr>
+      <w:tr>
+        <w:tc>
+          <w:tcPr>
+            <w:tcW w:type="dxa" w:w="2880"/>
+          </w:tcPr>
+          <w:p>
+            <w:r>
+              <w:rPr>
+                <w:rFonts w:ascii="Consolas" w:hAnsi="Consolas"/>
+                <w:b w:val="0"/>
+                <w:color w:val="A31F34"/>
+                <w:sz w:val="20"/>
+              </w:rPr>
+              <w:t>ocr_mau.py</w:t>
+            </w:r>
+          </w:p>
+        </w:tc>
+        <w:tc>
+          <w:tcPr>
+            <w:tcW w:type="dxa" w:w="2880"/>
+          </w:tcPr>
+          <w:p>
+            <w:r>
+              <w:rPr>
+                <w:b w:val="0"/>
+              </w:rPr>
+              <w:t>đọc chữ trong ảnh (EasyOCR)</w:t>
+            </w:r>
+          </w:p>
+        </w:tc>
+        <w:tc>
+          <w:tcPr>
+            <w:tcW w:type="dxa" w:w="2880"/>
+          </w:tcPr>
+          <w:p>
+            <w:r>
+              <w:rPr>
+                <w:b w:val="0"/>
+              </w:rPr>
+              <w:t xml:space="preserve">đề </w:t>
+            </w:r>
+            <w:r>
+              <w:rPr>
+                <w:b/>
+              </w:rPr>
+              <w:t>đọc chữ trong ảnh</w:t>
+            </w:r>
+            <w:r>
+              <w:rPr>
+                <w:b w:val="0"/>
+              </w:rPr>
+              <w:t xml:space="preserve">: Terminal </w:t>
+            </w:r>
+            <w:r>
+              <w:rPr>
+                <w:rFonts w:ascii="Consolas" w:hAnsi="Consolas"/>
+                <w:b w:val="0"/>
+                <w:color w:val="A31F34"/>
+                <w:sz w:val="20"/>
+              </w:rPr>
+              <w:t>cd ~/B1/KIT_BAI2 &amp;&amp; python ocr_mau.py</w:t>
+            </w:r>
+          </w:p>
+        </w:tc>
+      </w:tr>
+      <w:tr>
+        <w:tc>
+          <w:tcPr>
+            <w:tcW w:type="dxa" w:w="2880"/>
+          </w:tcPr>
+          <w:p>
+            <w:r>
+              <w:rPr>
+                <w:rFonts w:ascii="Consolas" w:hAnsi="Consolas"/>
+                <w:b w:val="0"/>
+                <w:color w:val="A31F34"/>
+                <w:sz w:val="20"/>
+              </w:rPr>
+              <w:t>tai_mo_hinh_cv.py</w:t>
+            </w:r>
+          </w:p>
+        </w:tc>
+        <w:tc>
+          <w:tcPr>
+            <w:tcW w:type="dxa" w:w="2880"/>
+          </w:tcPr>
+          <w:p>
+            <w:r>
+              <w:rPr>
+                <w:b w:val="0"/>
+              </w:rPr>
+              <w:t xml:space="preserve">tải mô hình cho </w:t>
+            </w:r>
+            <w:r>
+              <w:rPr>
+                <w:rFonts w:ascii="Consolas" w:hAnsi="Consolas"/>
+                <w:b w:val="0"/>
+                <w:color w:val="A31F34"/>
+                <w:sz w:val="20"/>
+              </w:rPr>
+              <w:t>yolo_mau.py</w:t>
+            </w:r>
+            <w:r>
+              <w:rPr>
+                <w:b w:val="0"/>
+              </w:rPr>
+              <w:t xml:space="preserve">, </w:t>
+            </w:r>
+            <w:r>
+              <w:rPr>
+                <w:rFonts w:ascii="Consolas" w:hAnsi="Consolas"/>
+                <w:b w:val="0"/>
+                <w:color w:val="A31F34"/>
+                <w:sz w:val="20"/>
+              </w:rPr>
+              <w:t>ocr_mau.py</w:t>
+            </w:r>
+            <w:r>
+              <w:rPr>
+                <w:b w:val="0"/>
+              </w:rPr>
+              <w:t xml:space="preserve">, </w:t>
+            </w:r>
+            <w:r>
+              <w:rPr>
+                <w:rFonts w:ascii="Consolas" w:hAnsi="Consolas"/>
+                <w:b w:val="0"/>
+                <w:color w:val="A31F34"/>
+                <w:sz w:val="20"/>
+              </w:rPr>
+              <w:t>bai2.py</w:t>
+            </w:r>
+          </w:p>
+        </w:tc>
+        <w:tc>
+          <w:tcPr>
+            <w:tcW w:type="dxa" w:w="2880"/>
+          </w:tcPr>
+          <w:p>
+            <w:r>
+              <w:rPr>
+                <w:b w:val="0"/>
+              </w:rPr>
+              <w:t xml:space="preserve">chỉ khi các file đó báo thiếu mô hình: </w:t>
+            </w:r>
+            <w:r>
+              <w:rPr>
+                <w:rFonts w:ascii="Consolas" w:hAnsi="Consolas"/>
+                <w:b w:val="0"/>
+                <w:color w:val="A31F34"/>
+                <w:sz w:val="20"/>
+              </w:rPr>
+              <w:t>cd ~/B1/KIT_BAI2 &amp;&amp; python tai_mo_hinh_cv.py --nhanh</w:t>
+            </w:r>
+          </w:p>
+        </w:tc>
+      </w:tr>
+      <w:tr>
+        <w:tc>
+          <w:tcPr>
+            <w:tcW w:type="dxa" w:w="2880"/>
+          </w:tcPr>
+          <w:p>
+            <w:r>
+              <w:rPr>
+                <w:rFonts w:ascii="Consolas" w:hAnsi="Consolas"/>
+                <w:b w:val="0"/>
+                <w:color w:val="A31F34"/>
+                <w:sz w:val="20"/>
+              </w:rPr>
+              <w:t>requirements.txt</w:t>
+            </w:r>
+          </w:p>
+        </w:tc>
+        <w:tc>
+          <w:tcPr>
+            <w:tcW w:type="dxa" w:w="2880"/>
+          </w:tcPr>
+          <w:p>
+            <w:r>
+              <w:rPr>
+                <w:b w:val="0"/>
+              </w:rPr>
+              <w:t>danh sách thư viện + phiên bản</w:t>
+            </w:r>
+          </w:p>
+        </w:tc>
+        <w:tc>
+          <w:tcPr>
+            <w:tcW w:type="dxa" w:w="2880"/>
+          </w:tcPr>
+          <w:p>
+            <w:r>
+              <w:rPr>
+                <w:b w:val="0"/>
+              </w:rPr>
+              <w:t>không cần (B0 đã cài)</w:t>
+            </w:r>
+          </w:p>
+        </w:tc>
+      </w:tr>
+      <w:tr>
+        <w:tc>
+          <w:tcPr>
+            <w:tcW w:type="dxa" w:w="2880"/>
+          </w:tcPr>
+          <w:p>
+            <w:r>
+              <w:rPr>
+                <w:rFonts w:ascii="Consolas" w:hAnsi="Consolas"/>
+                <w:b w:val="0"/>
+                <w:color w:val="A31F34"/>
+                <w:sz w:val="20"/>
+              </w:rPr>
+              <w:t>CHAY_BAI2.bat</w:t>
+            </w:r>
+            <w:r>
+              <w:rPr>
+                <w:b w:val="0"/>
+              </w:rPr>
+              <w:t xml:space="preserve">, </w:t>
+            </w:r>
+            <w:r>
+              <w:rPr>
+                <w:rFonts w:ascii="Consolas" w:hAnsi="Consolas"/>
+                <w:b w:val="0"/>
+                <w:color w:val="A31F34"/>
+                <w:sz w:val="20"/>
+              </w:rPr>
+              <w:t>CHAY_LAI_BAI2.bat</w:t>
+            </w:r>
+          </w:p>
+        </w:tc>
+        <w:tc>
+          <w:tcPr>
+            <w:tcW w:type="dxa" w:w="2880"/>
+          </w:tcPr>
+          <w:p>
+            <w:r>
+              <w:rPr>
+                <w:b w:val="0"/>
+              </w:rPr>
+              <w:t xml:space="preserve">bấm đúp chạy </w:t>
+            </w:r>
+            <w:r>
+              <w:rPr>
+                <w:rFonts w:ascii="Consolas" w:hAnsi="Consolas"/>
+                <w:b w:val="0"/>
+                <w:color w:val="A31F34"/>
+                <w:sz w:val="20"/>
+              </w:rPr>
+              <w:t>bai2.py</w:t>
+            </w:r>
+            <w:r>
+              <w:rPr>
+                <w:b w:val="0"/>
+              </w:rPr>
+              <w:t xml:space="preserve"> trên </w:t>
+            </w:r>
+            <w:r>
+              <w:rPr>
+                <w:b/>
+              </w:rPr>
+              <w:t>laptop Windows</w:t>
+            </w:r>
+          </w:p>
+        </w:tc>
+        <w:tc>
+          <w:tcPr>
+            <w:tcW w:type="dxa" w:w="2880"/>
+          </w:tcPr>
+          <w:p>
+            <w:r>
+              <w:rPr>
+                <w:b/>
+              </w:rPr>
+              <w:t>không dùng trên Jupyter</w:t>
+            </w:r>
+          </w:p>
+        </w:tc>
+      </w:tr>
+      <w:tr>
+        <w:tc>
+          <w:tcPr>
+            <w:tcW w:type="dxa" w:w="2880"/>
+          </w:tcPr>
+          <w:p>
+            <w:r>
+              <w:rPr>
+                <w:rFonts w:ascii="Consolas" w:hAnsi="Consolas"/>
+                <w:b w:val="0"/>
+                <w:color w:val="A31F34"/>
+                <w:sz w:val="20"/>
+              </w:rPr>
+              <w:t>CHAY_YOLO.bat</w:t>
+            </w:r>
+            <w:r>
+              <w:rPr>
+                <w:b w:val="0"/>
+              </w:rPr>
+              <w:t xml:space="preserve">, </w:t>
+            </w:r>
+            <w:r>
+              <w:rPr>
+                <w:rFonts w:ascii="Consolas" w:hAnsi="Consolas"/>
+                <w:b w:val="0"/>
+                <w:color w:val="A31F34"/>
+                <w:sz w:val="20"/>
+              </w:rPr>
+              <w:t>CHAY_LAI_YOLO.bat</w:t>
+            </w:r>
+            <w:r>
+              <w:rPr>
+                <w:b w:val="0"/>
+              </w:rPr>
+              <w:t xml:space="preserve">, </w:t>
+            </w:r>
+            <w:r>
+              <w:rPr>
+                <w:rFonts w:ascii="Consolas" w:hAnsi="Consolas"/>
+                <w:b w:val="0"/>
+                <w:color w:val="A31F34"/>
+                <w:sz w:val="20"/>
+              </w:rPr>
+              <w:t>CHAY_OCR.bat</w:t>
+            </w:r>
+          </w:p>
+        </w:tc>
+        <w:tc>
+          <w:tcPr>
+            <w:tcW w:type="dxa" w:w="2880"/>
+          </w:tcPr>
+          <w:p>
+            <w:r>
+              <w:rPr>
+                <w:b w:val="0"/>
+              </w:rPr>
+              <w:t>bấm đúp chạy YOLO / OCR trên laptop Windows</w:t>
+            </w:r>
+          </w:p>
+        </w:tc>
+        <w:tc>
+          <w:tcPr>
+            <w:tcW w:type="dxa" w:w="2880"/>
+          </w:tcPr>
+          <w:p>
+            <w:r>
+              <w:rPr>
+                <w:b/>
+              </w:rPr>
+              <w:t>không dùng trên Jupyter</w:t>
+            </w:r>
+          </w:p>
+        </w:tc>
+      </w:tr>
+      <w:tr>
+        <w:tc>
+          <w:tcPr>
+            <w:tcW w:type="dxa" w:w="2880"/>
+          </w:tcPr>
+          <w:p>
+            <w:r>
+              <w:rPr>
+                <w:rFonts w:ascii="Consolas" w:hAnsi="Consolas"/>
+                <w:b w:val="0"/>
+                <w:color w:val="A31F34"/>
+                <w:sz w:val="20"/>
+              </w:rPr>
+              <w:t>CAI_DAT_MAY_KHAC.bat</w:t>
+            </w:r>
+          </w:p>
+        </w:tc>
+        <w:tc>
+          <w:tcPr>
+            <w:tcW w:type="dxa" w:w="2880"/>
+          </w:tcPr>
+          <w:p>
+            <w:r>
+              <w:rPr>
+                <w:b w:val="0"/>
+              </w:rPr>
+              <w:t>cài mọi thứ lên một laptop Windows khác</w:t>
+            </w:r>
+          </w:p>
+        </w:tc>
+        <w:tc>
+          <w:tcPr>
+            <w:tcW w:type="dxa" w:w="2880"/>
+          </w:tcPr>
+          <w:p>
+            <w:r>
+              <w:rPr>
+                <w:b/>
+              </w:rPr>
+              <w:t>không dùng trên Jupyter</w:t>
+            </w:r>
+          </w:p>
+        </w:tc>
+      </w:tr>
+    </w:tbl>
+    <w:p/>
+    <w:p>
+      <w:r>
+        <w:rPr>
+          <w:b w:val="0"/>
+        </w:rPr>
+        <w:t xml:space="preserve">Ghi chú: đường dẫn </w:t>
+      </w:r>
+      <w:r>
+        <w:rPr>
+          <w:rFonts w:ascii="Consolas" w:hAnsi="Consolas"/>
+          <w:b w:val="0"/>
+          <w:color w:val="A31F34"/>
+          <w:sz w:val="20"/>
+        </w:rPr>
+        <w:t>~/B1/KIT_BAI2</w:t>
+      </w:r>
+      <w:r>
+        <w:rPr>
+          <w:b w:val="0"/>
+        </w:rPr>
+        <w:t xml:space="preserve"> là khi upload </w:t>
+      </w:r>
+      <w:r>
+        <w:rPr>
+          <w:rFonts w:ascii="Consolas" w:hAnsi="Consolas"/>
+          <w:b w:val="0"/>
+          <w:color w:val="A31F34"/>
+          <w:sz w:val="20"/>
+        </w:rPr>
+        <w:t>bai2.zip</w:t>
+      </w:r>
+      <w:r>
+        <w:rPr>
+          <w:b w:val="0"/>
+        </w:rPr>
+        <w:t xml:space="preserve"> / </w:t>
+      </w:r>
+      <w:r>
+        <w:rPr>
+          <w:rFonts w:ascii="Consolas" w:hAnsi="Consolas"/>
+          <w:b w:val="0"/>
+          <w:color w:val="A31F34"/>
+          <w:sz w:val="20"/>
+        </w:rPr>
+        <w:t>kit.zip</w:t>
+      </w:r>
+      <w:r>
+        <w:rPr>
+          <w:b w:val="0"/>
+        </w:rPr>
+        <w:t xml:space="preserve">. Lấy code bằng </w:t>
+      </w:r>
+      <w:r>
+        <w:rPr>
+          <w:rFonts w:ascii="Consolas" w:hAnsi="Consolas"/>
+          <w:b w:val="0"/>
+          <w:color w:val="A31F34"/>
+          <w:sz w:val="20"/>
+        </w:rPr>
+        <w:t>git clone</w:t>
+      </w:r>
+      <w:r>
+        <w:rPr>
+          <w:b w:val="0"/>
+        </w:rPr>
+        <w:t xml:space="preserve"> repo B2 thì thay bằng </w:t>
+      </w:r>
+      <w:r>
+        <w:rPr>
+          <w:rFonts w:ascii="Consolas" w:hAnsi="Consolas"/>
+          <w:b w:val="0"/>
+          <w:color w:val="A31F34"/>
+          <w:sz w:val="20"/>
+        </w:rPr>
+        <w:t>~/B2</w:t>
+      </w:r>
+      <w:r>
+        <w:rPr>
+          <w:b w:val="0"/>
+        </w:rPr>
+        <w:t>.</w:t>
+      </w:r>
+    </w:p>
+    <w:p>
+      <w:bookmarkStart w:id="9" w:name="muc_9"/>
+      <w:pPr>
+        <w:pStyle w:val="Heading2"/>
+      </w:pPr>
+      <w:r>
+        <w:rPr>
+          <w:b w:val="0"/>
+        </w:rPr>
         <w:t>PHẦN 7. BẢNG GIẢI THÍCH NHANH</w:t>
       </w:r>
-      <w:bookmarkEnd w:id="8"/>
+      <w:bookmarkEnd w:id="9"/>
     </w:p>
     <w:tbl>
       <w:tblPr>
@@ -4024,7 +5243,7 @@
     </w:tbl>
     <w:p/>
     <w:p>
-      <w:bookmarkStart w:id="9" w:name="muc_9"/>
+      <w:bookmarkStart w:id="10" w:name="muc_10"/>
       <w:pPr>
         <w:pStyle w:val="Heading2"/>
       </w:pPr>
@@ -4034,7 +5253,7 @@
         </w:rPr>
         <w:t>PHẦN 8. DÙNG AI CỦA BTC (chỉ để sửa lỗi; 200k mỗi phiên)</w:t>
       </w:r>
-      <w:bookmarkEnd w:id="9"/>
+      <w:bookmarkEnd w:id="10"/>
     </w:p>
     <w:p>
       <w:r>
@@ -4233,7 +5452,7 @@
       </w:r>
     </w:p>
     <w:p>
-      <w:bookmarkStart w:id="10" w:name="muc_10"/>
+      <w:bookmarkStart w:id="11" w:name="muc_11"/>
       <w:pPr>
         <w:pStyle w:val="Heading2"/>
       </w:pPr>
@@ -4243,7 +5462,7 @@
         </w:rPr>
         <w:t>GẶP LỖI</w:t>
       </w:r>
-      <w:bookmarkEnd w:id="10"/>
+      <w:bookmarkEnd w:id="11"/>
     </w:p>
     <w:tbl>
       <w:tblPr>
@@ -4717,7 +5936,7 @@
     </w:tbl>
     <w:p/>
     <w:p>
-      <w:bookmarkStart w:id="11" w:name="muc_11"/>
+      <w:bookmarkStart w:id="12" w:name="muc_12"/>
       <w:pPr>
         <w:pStyle w:val="Heading2"/>
       </w:pPr>
@@ -4727,7 +5946,7 @@
         </w:rPr>
         <w:t>BẢO VỆ BÀI 2 (1–2 phút)</w:t>
       </w:r>
-      <w:bookmarkEnd w:id="11"/>
+      <w:bookmarkEnd w:id="12"/>
     </w:p>
     <w:p>
       <w:pPr>

</xml_diff>